<commit_message>
Fix Chinese salary uppercase to match 15,000 monthly amount
Co-authored-by: marina2023124 <marina2023124@users.noreply.github.com>
</commit_message>
<xml_diff>
--- a/documents/收入证明_Income_Certificate_签证用模板.docx
+++ b/documents/收入证明_Income_Certificate_签证用模板.docx
@@ -217,129 +217,7 @@
         <w:jc w:val="left"/>
       </w:pPr>
       <w:r>
-        <w:rPr>
-          <w:rFonts w:ascii="Times New Roman" w:hAnsi="Times New Roman" w:eastAsia="宋体"/>
-          <w:b w:val="0"/>
-          <w:sz w:val="22"/>
-        </w:rPr>
-        <w:t xml:space="preserve">该员工目前税前月薪为人民币 </w:t>
-      </w:r>
-      <w:r>
-        <w:rPr>
-          <w:rFonts w:ascii="Times New Roman" w:hAnsi="Times New Roman" w:eastAsia="宋体"/>
-          <w:b/>
-          <w:sz w:val="22"/>
-        </w:rPr>
-        <w:t xml:space="preserve"> </w:t>
-      </w:r>
-      <w:r>
-        <w:rPr>
-          <w:rFonts w:hint="eastAsia" w:ascii="Times New Roman" w:hAnsi="Times New Roman" w:eastAsia="宋体"/>
-          <w:b/>
-          <w:sz w:val="22"/>
-          <w:lang w:val="en-US" w:eastAsia="zh-CN"/>
-        </w:rPr>
-        <w:t>1</w:t>
-      </w:r>
-      <w:r>
-        <w:rPr>
-          <w:rFonts w:ascii="Times New Roman" w:hAnsi="Times New Roman" w:eastAsia="宋体"/>
-          <w:b/>
-          <w:sz w:val="22"/>
-        </w:rPr>
-        <w:t>5,000</w:t>
-      </w:r>
-      <w:r>
-        <w:rPr>
-          <w:rFonts w:ascii="Times New Roman" w:hAnsi="Times New Roman" w:eastAsia="宋体"/>
-          <w:b w:val="0"/>
-          <w:sz w:val="22"/>
-        </w:rPr>
-        <w:t xml:space="preserve"> </w:t>
-      </w:r>
-      <w:r>
-        <w:rPr>
-          <w:rFonts w:ascii="Times New Roman" w:hAnsi="Times New Roman" w:eastAsia="宋体"/>
-          <w:b/>
-          <w:bCs/>
-          <w:sz w:val="22"/>
-        </w:rPr>
-        <w:t>元</w:t>
-      </w:r>
-      <w:r>
-        <w:rPr>
-          <w:rFonts w:ascii="Times New Roman" w:hAnsi="Times New Roman" w:eastAsia="宋体"/>
-          <w:b w:val="0"/>
-          <w:sz w:val="22"/>
-        </w:rPr>
-        <w:t>（大写：</w:t>
-      </w:r>
-      <w:r>
-        <w:rPr>
-          <w:rFonts w:hint="eastAsia" w:ascii="Times New Roman" w:hAnsi="Times New Roman" w:eastAsia="宋体"/>
-          <w:b/>
-          <w:sz w:val="22"/>
-          <w:lang w:val="en-US" w:eastAsia="zh-CN"/>
-        </w:rPr>
-        <w:t>壹</w:t>
-      </w:r>
-      <w:r>
-        <w:rPr>
-          <w:rFonts w:ascii="Times New Roman" w:hAnsi="Times New Roman" w:eastAsia="宋体"/>
-          <w:b/>
-          <w:sz w:val="22"/>
-        </w:rPr>
-        <w:t xml:space="preserve"> 贰万伍仟元整</w:t>
-      </w:r>
-      <w:r>
-        <w:rPr>
-          <w:rFonts w:ascii="Times New Roman" w:hAnsi="Times New Roman" w:eastAsia="宋体"/>
-          <w:b w:val="0"/>
-          <w:sz w:val="22"/>
-        </w:rPr>
-        <w:t xml:space="preserve">），税前年薪约为人民币 </w:t>
-      </w:r>
-      <w:r>
-        <w:rPr>
-          <w:rFonts w:ascii="Times New Roman" w:hAnsi="Times New Roman" w:eastAsia="宋体"/>
-          <w:b/>
-          <w:sz w:val="22"/>
-        </w:rPr>
-        <w:t xml:space="preserve"> </w:t>
-      </w:r>
-      <w:r>
-        <w:rPr>
-          <w:rFonts w:hint="eastAsia" w:ascii="Times New Roman" w:hAnsi="Times New Roman" w:eastAsia="宋体"/>
-          <w:b/>
-          <w:sz w:val="22"/>
-          <w:lang w:val="en-US" w:eastAsia="zh-CN"/>
-        </w:rPr>
-        <w:t>210</w:t>
-      </w:r>
-      <w:r>
-        <w:rPr>
-          <w:rFonts w:ascii="Times New Roman" w:hAnsi="Times New Roman" w:eastAsia="宋体"/>
-          <w:b/>
-          <w:sz w:val="22"/>
-        </w:rPr>
-        <w:t>,000</w:t>
-      </w:r>
-      <w:r>
-        <w:rPr>
-          <w:rFonts w:ascii="Times New Roman" w:hAnsi="Times New Roman" w:eastAsia="宋体"/>
-          <w:b/>
-          <w:bCs/>
-          <w:sz w:val="22"/>
-        </w:rPr>
-        <w:t>元</w:t>
-      </w:r>
-      <w:r>
-        <w:rPr>
-          <w:rFonts w:ascii="Times New Roman" w:hAnsi="Times New Roman" w:eastAsia="宋体"/>
-          <w:b w:val="0"/>
-          <w:sz w:val="22"/>
-        </w:rPr>
-        <w:t>。</w:t>
+        <w:t>该员工目前税前月薪为人民币 15,000 元（大写：壹万伍仟元整），税前年薪约为人民币 210,000 元（大写：贰拾壹万元整）。</w:t>
       </w:r>
     </w:p>
     <w:p>
@@ -348,7 +226,7 @@
         <w:jc w:val="left"/>
       </w:pPr>
       <w:r>
-        <w:t>The employee's current pre-tax monthly salary is RMB 15,000 (in words: Fifteen Thousand Yuan Only), with an approximate annual pre-tax income of RMB 210,000.</w:t>
+        <w:t>The employee's current pre-tax monthly salary is RMB 15,000 (in words: Fifteen Thousand Yuan Only), with an approximate annual pre-tax income of RMB 210,000 (in words: Two Hundred and Ten Thousand Yuan Only).</w:t>
       </w:r>
     </w:p>
     <w:p>

</xml_diff>